<commit_message>
Captions en fase 4 dokument
</commit_message>
<xml_diff>
--- a/Fases_Dokumentasie/Fase3_Reponsief+Tabelle+Webvorm.docx
+++ b/Fases_Dokumentasie/Fase3_Reponsief+Tabelle+Webvorm.docx
@@ -109,7 +109,7 @@
         <w:p>
           <w:r>
             <w:pict w14:anchorId="3FFEF07E">
-              <v:shape id="_x0000_s1033" type="#_x0000_t202" style="position:absolute;margin-left:100.25pt;margin-top:466.95pt;width:350.9pt;height:104.85pt;z-index:251660288" stroked="f">
+              <v:shape id="_x0000_s1033" type="#_x0000_t202" style="position:absolute;margin-left:100.25pt;margin-top:481.95pt;width:350.9pt;height:104.85pt;z-index:251660288" stroked="f">
                 <v:textbox style="mso-next-textbox:#_x0000_s1033">
                   <w:txbxContent>
                     <w:sdt>
@@ -1142,17 +1142,83 @@
       <w:pPr>
         <w:pStyle w:val="Heading2"/>
       </w:pPr>
-      <w:bookmarkStart w:id="3" w:name="_Toc226380851"/>
-      <w:r>
+      <w:bookmarkStart w:id="3" w:name="_Toc226443017"/>
+      <w:bookmarkStart w:id="4" w:name="_Toc226457384"/>
+      <w:r>
+        <w:t>Inleiding en doel</w:t>
+      </w:r>
+      <w:bookmarkEnd w:id="3"/>
+      <w:bookmarkEnd w:id="4"/>
+    </w:p>
+    <w:p>
+      <w:pPr>
+        <w:pStyle w:val="ListParagraph"/>
+        <w:numPr>
+          <w:ilvl w:val="0"/>
+          <w:numId w:val="37"/>
+        </w:numPr>
+      </w:pPr>
+      <w:r>
+        <w:t>Ek moet in hierdie fase responsiewe ontwerp implimenteer, tabelle en webvorms insit.</w:t>
+      </w:r>
+    </w:p>
+    <w:p>
+      <w:pPr>
+        <w:pStyle w:val="ListParagraph"/>
+        <w:numPr>
+          <w:ilvl w:val="0"/>
+          <w:numId w:val="37"/>
+        </w:numPr>
+      </w:pPr>
+      <w:r>
+        <w:t>Die responsiewe ontwerp is vir 3 verskillende skerm groottes tablette (tussen 480px en 768px) , mobiel (tussen 360px en 480px) en klein laptops en tablette (tussen 768px en 1024px).</w:t>
+      </w:r>
+    </w:p>
+    <w:p>
+      <w:pPr>
+        <w:pStyle w:val="ListParagraph"/>
+        <w:numPr>
+          <w:ilvl w:val="0"/>
+          <w:numId w:val="37"/>
+        </w:numPr>
+      </w:pPr>
+      <w:r>
+        <w:t>Ek moet 2 webvorms he en minstens 2 tabelle he om in fase 5 vir ‘n databasis te gebruik.</w:t>
+      </w:r>
+    </w:p>
+    <w:p>
+      <w:pPr>
+        <w:pStyle w:val="ListParagraph"/>
+        <w:numPr>
+          <w:ilvl w:val="0"/>
+          <w:numId w:val="37"/>
+        </w:numPr>
+      </w:pPr>
+      <w:r>
+        <w:t>Hierdie is sodat die webblad mooi lyk op nie net rekenaar skerms nie maar ook kleiner skerms.</w:t>
+      </w:r>
+    </w:p>
+    <w:p>
+      <w:r>
+        <w:br w:type="page"/>
+      </w:r>
+    </w:p>
+    <w:p>
+      <w:pPr>
+        <w:pStyle w:val="Heading2"/>
+      </w:pPr>
+      <w:bookmarkStart w:id="5" w:name="_Toc226380851"/>
+      <w:r>
+        <w:lastRenderedPageBreak/>
         <w:t>Skermskote</w:t>
       </w:r>
-      <w:bookmarkEnd w:id="3"/>
+      <w:bookmarkEnd w:id="5"/>
     </w:p>
     <w:p>
       <w:pPr>
         <w:pStyle w:val="Heading3"/>
       </w:pPr>
-      <w:bookmarkStart w:id="4" w:name="_Toc226380852"/>
+      <w:bookmarkStart w:id="6" w:name="_Toc226380852"/>
       <w:r>
         <w:rPr>
           <w:noProof/>
@@ -1225,13 +1291,13 @@
       <w:r>
         <w:t>Rekenaar skermskoot</w:t>
       </w:r>
-      <w:bookmarkEnd w:id="4"/>
+      <w:bookmarkEnd w:id="6"/>
     </w:p>
     <w:p>
       <w:pPr>
         <w:pStyle w:val="Heading3"/>
       </w:pPr>
-      <w:bookmarkStart w:id="5" w:name="_Toc226380853"/>
+      <w:bookmarkStart w:id="7" w:name="_Toc226380853"/>
       <w:r>
         <w:rPr>
           <w:noProof/>
@@ -1388,7 +1454,7 @@
       <w:r>
         <w:t>Mobiele skermskote</w:t>
       </w:r>
-      <w:bookmarkEnd w:id="5"/>
+      <w:bookmarkEnd w:id="7"/>
     </w:p>
     <w:p>
       <w:pPr>
@@ -1406,14 +1472,14 @@
       <w:pPr>
         <w:pStyle w:val="Heading2"/>
       </w:pPr>
-      <w:bookmarkStart w:id="6" w:name="_Toc221612739"/>
-      <w:bookmarkStart w:id="7" w:name="_Toc226380854"/>
+      <w:bookmarkStart w:id="8" w:name="_Toc221612739"/>
+      <w:bookmarkStart w:id="9" w:name="_Toc226380854"/>
       <w:r>
         <w:lastRenderedPageBreak/>
         <w:t>Tabelle</w:t>
       </w:r>
-      <w:bookmarkEnd w:id="6"/>
-      <w:bookmarkEnd w:id="7"/>
+      <w:bookmarkEnd w:id="8"/>
+      <w:bookmarkEnd w:id="9"/>
     </w:p>
     <w:p>
       <w:pPr>
@@ -1459,6 +1525,9 @@
       <w:r>
         <w:t xml:space="preserve"> en prys per eenheid.</w:t>
       </w:r>
+      <w:r>
+        <w:t xml:space="preserve"> Die tabel is dus amper soos ‘n pryslys.</w:t>
+      </w:r>
     </w:p>
     <w:p>
       <w:pPr>
@@ -1487,7 +1556,16 @@
         <w:t>thead</w:t>
       </w:r>
       <w:r>
-        <w:t xml:space="preserve"> (donker groen agtergrond met wit teks) en tbody.</w:t>
+        <w:t xml:space="preserve"> (donker groen agtergrond met wit teks) en </w:t>
+      </w:r>
+      <w:r>
+        <w:rPr>
+          <w:rStyle w:val="Heading5Char"/>
+        </w:rPr>
+        <w:t>tbody</w:t>
+      </w:r>
+      <w:r>
+        <w:t xml:space="preserve"> om die tabel en sy kleure mooi te formateer.</w:t>
       </w:r>
     </w:p>
     <w:p>
@@ -1516,7 +1594,13 @@
         <w:t>price</w:t>
       </w:r>
       <w:r>
-        <w:t xml:space="preserve"> (vetdruk, groen, regs uitgelyn).</w:t>
+        <w:t xml:space="preserve"> (vetdruk, groen, regs uitgelyn)</w:t>
+      </w:r>
+      <w:r>
+        <w:t xml:space="preserve"> sodat die pryse mooi uitstaan</w:t>
+      </w:r>
+      <w:r>
+        <w:t>.</w:t>
       </w:r>
     </w:p>
     <w:p>
@@ -1764,13 +1848,13 @@
       <w:pPr>
         <w:pStyle w:val="Heading2"/>
       </w:pPr>
-      <w:bookmarkStart w:id="8" w:name="_Toc221612740"/>
-      <w:bookmarkStart w:id="9" w:name="_Toc226380855"/>
+      <w:bookmarkStart w:id="10" w:name="_Toc221612740"/>
+      <w:bookmarkStart w:id="11" w:name="_Toc226380855"/>
       <w:r>
         <w:t>Webvorms</w:t>
       </w:r>
-      <w:bookmarkEnd w:id="8"/>
-      <w:bookmarkEnd w:id="9"/>
+      <w:bookmarkEnd w:id="10"/>
+      <w:bookmarkEnd w:id="11"/>
     </w:p>
     <w:p>
       <w:pPr>
@@ -2066,21 +2150,22 @@
       <w:pPr>
         <w:pStyle w:val="Heading2"/>
       </w:pPr>
-      <w:bookmarkStart w:id="10" w:name="_Toc226380856"/>
-      <w:r>
+      <w:bookmarkStart w:id="12" w:name="_Toc226380856"/>
+      <w:r>
+        <w:lastRenderedPageBreak/>
         <w:t>Responsiewe CSS verduideliking</w:t>
       </w:r>
-      <w:bookmarkEnd w:id="10"/>
+      <w:bookmarkEnd w:id="12"/>
     </w:p>
     <w:p>
       <w:pPr>
         <w:pStyle w:val="Heading3"/>
       </w:pPr>
-      <w:bookmarkStart w:id="11" w:name="_Toc226380857"/>
+      <w:bookmarkStart w:id="13" w:name="_Toc226380857"/>
       <w:r>
         <w:t>Mobiele skerm (480 tot 360)</w:t>
       </w:r>
-      <w:bookmarkEnd w:id="11"/>
+      <w:bookmarkEnd w:id="13"/>
     </w:p>
     <w:p>
       <w:pPr>
@@ -2147,7 +2232,6 @@
         </w:numPr>
       </w:pPr>
       <w:r>
-        <w:lastRenderedPageBreak/>
         <w:t>(.nav)</w:t>
       </w:r>
     </w:p>
@@ -2240,10 +2324,7 @@
         <w:t>logo-teks h1</w:t>
       </w:r>
       <w:r>
-        <w:t xml:space="preserve"> ,</w:t>
-      </w:r>
-      <w:r>
-        <w:t xml:space="preserve"> </w:t>
+        <w:t xml:space="preserve"> , </w:t>
       </w:r>
       <w:r>
         <w:rPr>
@@ -2485,25 +2566,7 @@
         </w:numPr>
       </w:pPr>
       <w:r>
-        <w:t xml:space="preserve">Die </w:t>
-      </w:r>
-      <w:r>
-        <w:t>bemarking</w:t>
-      </w:r>
-      <w:r>
-        <w:t xml:space="preserve"> video op die Oor</w:t>
-      </w:r>
-      <w:r>
-        <w:t>_o</w:t>
-      </w:r>
-      <w:r>
-        <w:t>ns</w:t>
-      </w:r>
-      <w:r>
-        <w:t xml:space="preserve"> </w:t>
-      </w:r>
-      <w:r>
-        <w:t xml:space="preserve">blad (#marketingVideo) en alle keyframe-animasies (soos die pulse-effek op </w:t>
+        <w:t xml:space="preserve">Die bemarking video op die Oor_ons blad (#marketingVideo) en alle keyframe-animasies (soos die pulse-effek op </w:t>
       </w:r>
       <w:r>
         <w:rPr>
@@ -2613,31 +2676,13 @@
         </w:numPr>
       </w:pPr>
       <w:r>
-        <w:t>Die video</w:t>
-      </w:r>
-      <w:r>
-        <w:t xml:space="preserve"> </w:t>
-      </w:r>
-      <w:r>
-        <w:t>end logo</w:t>
-      </w:r>
-      <w:r>
-        <w:t xml:space="preserve"> </w:t>
-      </w:r>
-      <w:r>
-        <w:t>blok (</w:t>
+        <w:t>Die video end logo blok (</w:t>
       </w:r>
       <w:r>
         <w:rPr>
           <w:rStyle w:val="Heading5Char"/>
         </w:rPr>
-        <w:t>#videoEndLogo</w:t>
-      </w:r>
-      <w:r>
-        <w:rPr>
-          <w:rStyle w:val="Heading5Char"/>
-        </w:rPr>
-        <w:t xml:space="preserve"> </w:t>
+        <w:t xml:space="preserve">#videoEndLogo </w:t>
       </w:r>
       <w:r>
         <w:rPr>
@@ -2666,13 +2711,7 @@
         </w:numPr>
       </w:pPr>
       <w:r>
-        <w:t xml:space="preserve">Dit </w:t>
-      </w:r>
-      <w:r>
-        <w:t>voorkom</w:t>
-      </w:r>
-      <w:r>
-        <w:t xml:space="preserve"> dat animasies of video’s die gebruiker se aandag aftrek.</w:t>
+        <w:t>Dit voorkom dat animasies of video’s die gebruiker se aandag aftrek.</w:t>
       </w:r>
     </w:p>
     <w:p>
@@ -2712,10 +2751,7 @@
         <w:t>footer-container</w:t>
       </w:r>
       <w:r>
-        <w:t>)</w:t>
-      </w:r>
-      <w:r>
-        <w:t xml:space="preserve"> word vertikaal gestapel </w:t>
+        <w:t xml:space="preserve">) word vertikaal gestapel </w:t>
       </w:r>
       <w:r>
         <w:t>(</w:t>
@@ -2746,11 +2782,11 @@
       <w:pPr>
         <w:pStyle w:val="Heading3"/>
       </w:pPr>
-      <w:bookmarkStart w:id="12" w:name="_Toc226380858"/>
+      <w:bookmarkStart w:id="14" w:name="_Toc226380858"/>
       <w:r>
         <w:t>Tablet skerm (480 tot 768)</w:t>
       </w:r>
-      <w:bookmarkEnd w:id="12"/>
+      <w:bookmarkEnd w:id="14"/>
     </w:p>
     <w:p>
       <w:pPr>
@@ -3015,6 +3051,7 @@
         <w:pStyle w:val="Heading4"/>
       </w:pPr>
       <w:r>
+        <w:lastRenderedPageBreak/>
         <w:t>Hero</w:t>
       </w:r>
     </w:p>
@@ -3067,7 +3104,6 @@
         <w:pStyle w:val="Heading4"/>
       </w:pPr>
       <w:r>
-        <w:lastRenderedPageBreak/>
         <w:t>Tabel</w:t>
       </w:r>
     </w:p>
@@ -3546,11 +3582,11 @@
       <w:pPr>
         <w:pStyle w:val="Heading3"/>
       </w:pPr>
-      <w:bookmarkStart w:id="13" w:name="_Toc226380859"/>
+      <w:bookmarkStart w:id="15" w:name="_Toc226380859"/>
       <w:r>
         <w:t>Klein skootrekenaar en tablet</w:t>
       </w:r>
-      <w:bookmarkEnd w:id="13"/>
+      <w:bookmarkEnd w:id="15"/>
     </w:p>
     <w:p>
       <w:pPr>
@@ -3807,6 +3843,7 @@
         <w:pStyle w:val="Heading4"/>
       </w:pPr>
       <w:r>
+        <w:lastRenderedPageBreak/>
         <w:t>Hero</w:t>
       </w:r>
     </w:p>
@@ -7121,6 +7158,119 @@
     </w:lvl>
   </w:abstractNum>
   <w:abstractNum w:abstractNumId="33" w15:restartNumberingAfterBreak="0">
+    <w:nsid w:val="72697DA9"/>
+    <w:multiLevelType w:val="hybridMultilevel"/>
+    <w:tmpl w:val="005C1A4A"/>
+    <w:lvl w:ilvl="0" w:tplc="1C090001">
+      <w:start w:val="1"/>
+      <w:numFmt w:val="bullet"/>
+      <w:lvlText w:val=""/>
+      <w:lvlJc w:val="left"/>
+      <w:pPr>
+        <w:ind w:left="360" w:hanging="360"/>
+      </w:pPr>
+      <w:rPr>
+        <w:rFonts w:ascii="Symbol" w:hAnsi="Symbol" w:hint="default"/>
+      </w:rPr>
+    </w:lvl>
+    <w:lvl w:ilvl="1" w:tplc="1C090003" w:tentative="1">
+      <w:start w:val="1"/>
+      <w:numFmt w:val="bullet"/>
+      <w:lvlText w:val="o"/>
+      <w:lvlJc w:val="left"/>
+      <w:pPr>
+        <w:ind w:left="1080" w:hanging="360"/>
+      </w:pPr>
+      <w:rPr>
+        <w:rFonts w:ascii="Courier New" w:hAnsi="Courier New" w:cs="Courier New" w:hint="default"/>
+      </w:rPr>
+    </w:lvl>
+    <w:lvl w:ilvl="2" w:tplc="1C090005" w:tentative="1">
+      <w:start w:val="1"/>
+      <w:numFmt w:val="bullet"/>
+      <w:lvlText w:val=""/>
+      <w:lvlJc w:val="left"/>
+      <w:pPr>
+        <w:ind w:left="1800" w:hanging="360"/>
+      </w:pPr>
+      <w:rPr>
+        <w:rFonts w:ascii="Wingdings" w:hAnsi="Wingdings" w:hint="default"/>
+      </w:rPr>
+    </w:lvl>
+    <w:lvl w:ilvl="3" w:tplc="1C090001" w:tentative="1">
+      <w:start w:val="1"/>
+      <w:numFmt w:val="bullet"/>
+      <w:lvlText w:val=""/>
+      <w:lvlJc w:val="left"/>
+      <w:pPr>
+        <w:ind w:left="2520" w:hanging="360"/>
+      </w:pPr>
+      <w:rPr>
+        <w:rFonts w:ascii="Symbol" w:hAnsi="Symbol" w:hint="default"/>
+      </w:rPr>
+    </w:lvl>
+    <w:lvl w:ilvl="4" w:tplc="1C090003" w:tentative="1">
+      <w:start w:val="1"/>
+      <w:numFmt w:val="bullet"/>
+      <w:lvlText w:val="o"/>
+      <w:lvlJc w:val="left"/>
+      <w:pPr>
+        <w:ind w:left="3240" w:hanging="360"/>
+      </w:pPr>
+      <w:rPr>
+        <w:rFonts w:ascii="Courier New" w:hAnsi="Courier New" w:cs="Courier New" w:hint="default"/>
+      </w:rPr>
+    </w:lvl>
+    <w:lvl w:ilvl="5" w:tplc="1C090005" w:tentative="1">
+      <w:start w:val="1"/>
+      <w:numFmt w:val="bullet"/>
+      <w:lvlText w:val=""/>
+      <w:lvlJc w:val="left"/>
+      <w:pPr>
+        <w:ind w:left="3960" w:hanging="360"/>
+      </w:pPr>
+      <w:rPr>
+        <w:rFonts w:ascii="Wingdings" w:hAnsi="Wingdings" w:hint="default"/>
+      </w:rPr>
+    </w:lvl>
+    <w:lvl w:ilvl="6" w:tplc="1C090001" w:tentative="1">
+      <w:start w:val="1"/>
+      <w:numFmt w:val="bullet"/>
+      <w:lvlText w:val=""/>
+      <w:lvlJc w:val="left"/>
+      <w:pPr>
+        <w:ind w:left="4680" w:hanging="360"/>
+      </w:pPr>
+      <w:rPr>
+        <w:rFonts w:ascii="Symbol" w:hAnsi="Symbol" w:hint="default"/>
+      </w:rPr>
+    </w:lvl>
+    <w:lvl w:ilvl="7" w:tplc="1C090003" w:tentative="1">
+      <w:start w:val="1"/>
+      <w:numFmt w:val="bullet"/>
+      <w:lvlText w:val="o"/>
+      <w:lvlJc w:val="left"/>
+      <w:pPr>
+        <w:ind w:left="5400" w:hanging="360"/>
+      </w:pPr>
+      <w:rPr>
+        <w:rFonts w:ascii="Courier New" w:hAnsi="Courier New" w:cs="Courier New" w:hint="default"/>
+      </w:rPr>
+    </w:lvl>
+    <w:lvl w:ilvl="8" w:tplc="1C090005" w:tentative="1">
+      <w:start w:val="1"/>
+      <w:numFmt w:val="bullet"/>
+      <w:lvlText w:val=""/>
+      <w:lvlJc w:val="left"/>
+      <w:pPr>
+        <w:ind w:left="6120" w:hanging="360"/>
+      </w:pPr>
+      <w:rPr>
+        <w:rFonts w:ascii="Wingdings" w:hAnsi="Wingdings" w:hint="default"/>
+      </w:rPr>
+    </w:lvl>
+  </w:abstractNum>
+  <w:abstractNum w:abstractNumId="34" w15:restartNumberingAfterBreak="0">
     <w:nsid w:val="74B05C1E"/>
     <w:multiLevelType w:val="hybridMultilevel"/>
     <w:tmpl w:val="70AC0C22"/>
@@ -7233,7 +7383,7 @@
       </w:rPr>
     </w:lvl>
   </w:abstractNum>
-  <w:abstractNum w:abstractNumId="34" w15:restartNumberingAfterBreak="0">
+  <w:abstractNum w:abstractNumId="35" w15:restartNumberingAfterBreak="0">
     <w:nsid w:val="7C300F4C"/>
     <w:multiLevelType w:val="hybridMultilevel"/>
     <w:tmpl w:val="E78A3430"/>
@@ -7319,7 +7469,7 @@
       </w:pPr>
     </w:lvl>
   </w:abstractNum>
-  <w:abstractNum w:abstractNumId="35" w15:restartNumberingAfterBreak="0">
+  <w:abstractNum w:abstractNumId="36" w15:restartNumberingAfterBreak="0">
     <w:nsid w:val="7CD30BE9"/>
     <w:multiLevelType w:val="multilevel"/>
     <w:tmpl w:val="3DA67334"/>
@@ -7502,7 +7652,7 @@
     <w:abstractNumId w:val="0"/>
   </w:num>
   <w:num w:numId="24" w16cid:durableId="287056098">
-    <w:abstractNumId w:val="34"/>
+    <w:abstractNumId w:val="35"/>
   </w:num>
   <w:num w:numId="25" w16cid:durableId="449594776">
     <w:abstractNumId w:val="5"/>
@@ -7517,7 +7667,7 @@
     <w:abstractNumId w:val="12"/>
   </w:num>
   <w:num w:numId="29" w16cid:durableId="140467374">
-    <w:abstractNumId w:val="35"/>
+    <w:abstractNumId w:val="36"/>
   </w:num>
   <w:num w:numId="30" w16cid:durableId="191843358">
     <w:abstractNumId w:val="21"/>
@@ -7532,13 +7682,16 @@
     <w:abstractNumId w:val="23"/>
   </w:num>
   <w:num w:numId="34" w16cid:durableId="1412922212">
-    <w:abstractNumId w:val="33"/>
+    <w:abstractNumId w:val="34"/>
   </w:num>
   <w:num w:numId="35" w16cid:durableId="1433472894">
     <w:abstractNumId w:val="1"/>
   </w:num>
   <w:num w:numId="36" w16cid:durableId="487288615">
     <w:abstractNumId w:val="3"/>
+  </w:num>
+  <w:num w:numId="37" w16cid:durableId="847523915">
+    <w:abstractNumId w:val="33"/>
   </w:num>
 </w:numbering>
 </file>
@@ -8107,6 +8260,7 @@
   <w:style w:type="character" w:default="1" w:styleId="DefaultParagraphFont">
     <w:name w:val="Default Paragraph Font"/>
     <w:uiPriority w:val="1"/>
+    <w:semiHidden/>
     <w:unhideWhenUsed/>
   </w:style>
   <w:style w:type="table" w:default="1" w:styleId="TableNormal">

</xml_diff>

<commit_message>
Fase 3 dokument opdateer
</commit_message>
<xml_diff>
--- a/Fases_Dokumentasie/Fase3_Reponsief+Tabelle+Webvorm.docx
+++ b/Fases_Dokumentasie/Fase3_Reponsief+Tabelle+Webvorm.docx
@@ -1823,13 +1823,25 @@
         </w:numPr>
       </w:pPr>
       <w:r>
-        <w:t xml:space="preserve">Status verander na LAAG </w:t>
+        <w:t xml:space="preserve">Status verander na </w:t>
+      </w:r>
+      <w:r>
+        <w:t>“</w:t>
+      </w:r>
+      <w:r>
+        <w:t xml:space="preserve">LAAG </w:t>
       </w:r>
       <w:r>
         <w:t>-</w:t>
       </w:r>
       <w:r>
-        <w:t xml:space="preserve"> Bestel! as </w:t>
+        <w:t xml:space="preserve"> Bestel!</w:t>
+      </w:r>
+      <w:r>
+        <w:t>”</w:t>
+      </w:r>
+      <w:r>
+        <w:t xml:space="preserve"> as </w:t>
       </w:r>
       <w:r>
         <w:t xml:space="preserve">die </w:t>
@@ -1880,24 +1892,7 @@
         </w:numPr>
       </w:pPr>
       <w:r>
-        <w:t xml:space="preserve">Die vorm ondersteun dinamiese produk-byevoeging (meervoudige rye met </w:t>
-      </w:r>
-      <w:r>
-        <w:rPr>
-          <w:rStyle w:val="Heading5Char"/>
-          <w:b/>
-          <w:bCs/>
-        </w:rPr>
-        <w:t>.</w:t>
-      </w:r>
-      <w:r>
-        <w:rPr>
-          <w:rStyle w:val="Heading5Char"/>
-        </w:rPr>
-        <w:t>product-row</w:t>
-      </w:r>
-      <w:r>
-        <w:t>).</w:t>
+        <w:t>Die vorm vra vir die gebruiker se kontakbesonderhede, of hul die produkte self wil afhaal of afgelewer wil he asook betaalopsies en die nodige inligting.</w:t>
       </w:r>
     </w:p>
     <w:p>
@@ -1909,16 +1904,24 @@
         </w:numPr>
       </w:pPr>
       <w:r>
-        <w:t xml:space="preserve">Elke ry het ’n </w:t>
-      </w:r>
-      <w:r>
-        <w:rPr>
-          <w:rStyle w:val="CSSKlasreelsChar"/>
-        </w:rPr>
-        <w:t>&lt;select&gt;</w:t>
-      </w:r>
-      <w:r>
-        <w:t xml:space="preserve"> vir produkkeuse en ’n hoeveelheid-invoer.</w:t>
+        <w:t xml:space="preserve">Die vorm ondersteun dinamiese produk-byevoeging (meervoudige rye met </w:t>
+      </w:r>
+      <w:r>
+        <w:rPr>
+          <w:rStyle w:val="Heading5Char"/>
+          <w:b/>
+          <w:bCs/>
+        </w:rPr>
+        <w:t>.</w:t>
+      </w:r>
+      <w:r>
+        <w:rPr>
+          <w:rStyle w:val="Heading5Char"/>
+        </w:rPr>
+        <w:t>product-row</w:t>
+      </w:r>
+      <w:r>
+        <w:t>).</w:t>
       </w:r>
     </w:p>
     <w:p>
@@ -1930,16 +1933,16 @@
         </w:numPr>
       </w:pPr>
       <w:r>
-        <w:t>Totaal word intyds bereken met JavaScript (</w:t>
+        <w:t xml:space="preserve">Elke ry het ’n </w:t>
       </w:r>
       <w:r>
         <w:rPr>
           <w:rStyle w:val="CSSKlasreelsChar"/>
         </w:rPr>
-        <w:t>calculateTotal()</w:t>
-      </w:r>
-      <w:r>
-        <w:t>).</w:t>
+        <w:t>&lt;select&gt;</w:t>
+      </w:r>
+      <w:r>
+        <w:t xml:space="preserve"> vir produkkeuse en ’n hoeveelheid-invoer.</w:t>
       </w:r>
     </w:p>
     <w:p>
@@ -1951,25 +1954,16 @@
         </w:numPr>
       </w:pPr>
       <w:r>
-        <w:t xml:space="preserve">Afleweringsopsies (self-afhaal of aflewering) wys/versteek adresse en afhaal-datum/tyd velde via </w:t>
+        <w:t>Totaal word intyds bereken met JavaScript (</w:t>
       </w:r>
       <w:r>
         <w:rPr>
           <w:rStyle w:val="CSSKlasreelsChar"/>
         </w:rPr>
-        <w:t>toggleAddressField()</w:t>
-      </w:r>
-      <w:r>
-        <w:t xml:space="preserve"> en </w:t>
-      </w:r>
-      <w:r>
-        <w:rPr>
-          <w:rStyle w:val="CSSKlasreelsChar"/>
-        </w:rPr>
-        <w:t>togglePickupDateField()</w:t>
-      </w:r>
-      <w:r>
-        <w:t>.</w:t>
+        <w:t>calculateTotal()</w:t>
+      </w:r>
+      <w:r>
+        <w:t>).</w:t>
       </w:r>
     </w:p>
     <w:p>
@@ -1981,19 +1975,25 @@
         </w:numPr>
       </w:pPr>
       <w:r>
-        <w:t>Betaalafdeling verskyn eers as</w:t>
-      </w:r>
-      <w:r>
-        <w:t xml:space="preserve"> die</w:t>
-      </w:r>
-      <w:r>
-        <w:t xml:space="preserve"> totaal </w:t>
-      </w:r>
-      <w:r>
-        <w:t>‘n item gekies is</w:t>
-      </w:r>
-      <w:r>
-        <w:t>, met keuses vir kaart, Apple Pay of Google Pay.</w:t>
+        <w:t xml:space="preserve">Afleweringsopsies (self-afhaal of aflewering) wys/versteek adresse en afhaal-datum/tyd velde via </w:t>
+      </w:r>
+      <w:r>
+        <w:rPr>
+          <w:rStyle w:val="CSSKlasreelsChar"/>
+        </w:rPr>
+        <w:t>toggleAddressField()</w:t>
+      </w:r>
+      <w:r>
+        <w:t xml:space="preserve"> en </w:t>
+      </w:r>
+      <w:r>
+        <w:rPr>
+          <w:rStyle w:val="CSSKlasreelsChar"/>
+        </w:rPr>
+        <w:t>togglePickupDateField()</w:t>
+      </w:r>
+      <w:r>
+        <w:t>.</w:t>
       </w:r>
     </w:p>
     <w:p>
@@ -2005,7 +2005,19 @@
         </w:numPr>
       </w:pPr>
       <w:r>
-        <w:t>Kaartbesonderhede word gevalideer (kaartnommer-formatering, expiry MM/YY, CVV).</w:t>
+        <w:t>Betaalafdeling verskyn eers as</w:t>
+      </w:r>
+      <w:r>
+        <w:t xml:space="preserve"> die</w:t>
+      </w:r>
+      <w:r>
+        <w:t xml:space="preserve"> totaal </w:t>
+      </w:r>
+      <w:r>
+        <w:t>‘n item gekies is</w:t>
+      </w:r>
+      <w:r>
+        <w:t>, met keuses vir kaart, Apple Pay of Google Pay.</w:t>
       </w:r>
     </w:p>
     <w:p>
@@ -2017,73 +2029,7 @@
         </w:numPr>
       </w:pPr>
       <w:r>
-        <w:t xml:space="preserve">Die vorm gebruik </w:t>
-      </w:r>
-      <w:r>
-        <w:rPr>
-          <w:rStyle w:val="Heading5Char"/>
-          <w:b/>
-          <w:bCs/>
-        </w:rPr>
-        <w:t>.</w:t>
-      </w:r>
-      <w:r>
-        <w:rPr>
-          <w:rStyle w:val="Heading5Char"/>
-        </w:rPr>
-        <w:t>form-group</w:t>
-      </w:r>
-      <w:r>
-        <w:t xml:space="preserve">, </w:t>
-      </w:r>
-      <w:r>
-        <w:rPr>
-          <w:rStyle w:val="Heading5Char"/>
-          <w:b/>
-          <w:bCs/>
-        </w:rPr>
-        <w:t>.</w:t>
-      </w:r>
-      <w:r>
-        <w:rPr>
-          <w:rStyle w:val="Heading5Char"/>
-        </w:rPr>
-        <w:t>submit-btn</w:t>
-      </w:r>
-      <w:r>
-        <w:t xml:space="preserve"> en </w:t>
-      </w:r>
-      <w:r>
-        <w:rPr>
-          <w:rStyle w:val="Heading5Char"/>
-          <w:b/>
-          <w:bCs/>
-        </w:rPr>
-        <w:t>.</w:t>
-      </w:r>
-      <w:r>
-        <w:rPr>
-          <w:rStyle w:val="Heading5Char"/>
-        </w:rPr>
-        <w:t>checkbox-group</w:t>
-      </w:r>
-      <w:r>
-        <w:t xml:space="preserve"> vir konsekwente styl.</w:t>
-      </w:r>
-    </w:p>
-    <w:p>
-      <w:pPr>
-        <w:rPr>
-          <w:b/>
-          <w:bCs/>
-        </w:rPr>
-      </w:pPr>
-      <w:r>
-        <w:rPr>
-          <w:b/>
-          <w:bCs/>
-        </w:rPr>
-        <w:t>Kontakvorm</w:t>
+        <w:t>Kaartbesonderhede word gevalideer (kaartnommer-formatering, expiry MM/YY, CVV).</w:t>
       </w:r>
     </w:p>
     <w:p>
@@ -2095,7 +2041,73 @@
         </w:numPr>
       </w:pPr>
       <w:r>
-        <w:t>Die vorm bevat naam, e-pos, rede vir kontak (Navrae of Plaas besoek), opsionele besoek-datum/tyd en boodskap.</w:t>
+        <w:t xml:space="preserve">Die vorm gebruik </w:t>
+      </w:r>
+      <w:r>
+        <w:rPr>
+          <w:rStyle w:val="Heading5Char"/>
+          <w:b/>
+          <w:bCs/>
+        </w:rPr>
+        <w:t>.</w:t>
+      </w:r>
+      <w:r>
+        <w:rPr>
+          <w:rStyle w:val="Heading5Char"/>
+        </w:rPr>
+        <w:t>form-group</w:t>
+      </w:r>
+      <w:r>
+        <w:t xml:space="preserve">, </w:t>
+      </w:r>
+      <w:r>
+        <w:rPr>
+          <w:rStyle w:val="Heading5Char"/>
+          <w:b/>
+          <w:bCs/>
+        </w:rPr>
+        <w:t>.</w:t>
+      </w:r>
+      <w:r>
+        <w:rPr>
+          <w:rStyle w:val="Heading5Char"/>
+        </w:rPr>
+        <w:t>submit-btn</w:t>
+      </w:r>
+      <w:r>
+        <w:t xml:space="preserve"> en </w:t>
+      </w:r>
+      <w:r>
+        <w:rPr>
+          <w:rStyle w:val="Heading5Char"/>
+          <w:b/>
+          <w:bCs/>
+        </w:rPr>
+        <w:t>.</w:t>
+      </w:r>
+      <w:r>
+        <w:rPr>
+          <w:rStyle w:val="Heading5Char"/>
+        </w:rPr>
+        <w:t>checkbox-group</w:t>
+      </w:r>
+      <w:r>
+        <w:t xml:space="preserve"> vir konsekwente styl.</w:t>
+      </w:r>
+    </w:p>
+    <w:p>
+      <w:pPr>
+        <w:rPr>
+          <w:b/>
+          <w:bCs/>
+        </w:rPr>
+      </w:pPr>
+      <w:r>
+        <w:rPr>
+          <w:b/>
+          <w:bCs/>
+        </w:rPr>
+        <w:t>Kontakvorm</w:t>
       </w:r>
     </w:p>
     <w:p>
@@ -2107,7 +2119,31 @@
         </w:numPr>
       </w:pPr>
       <w:r>
-        <w:t>Die besoek-datum/tyd groep word slegs gewys as “Plaas besoek” gekies word.</w:t>
+        <w:t>Die vorm bevat naam, e-pos, rede vir kontak (</w:t>
+      </w:r>
+      <w:r>
+        <w:t>n</w:t>
+      </w:r>
+      <w:r>
+        <w:t xml:space="preserve">avrae of </w:t>
+      </w:r>
+      <w:r>
+        <w:t>p</w:t>
+      </w:r>
+      <w:r>
+        <w:t>laas besoek), opsionele besoek</w:t>
+      </w:r>
+      <w:r>
+        <w:t xml:space="preserve"> </w:t>
+      </w:r>
+      <w:r>
+        <w:t>datum</w:t>
+      </w:r>
+      <w:r>
+        <w:t xml:space="preserve"> ,</w:t>
+      </w:r>
+      <w:r>
+        <w:t>tyd en boodskap.</w:t>
       </w:r>
     </w:p>
     <w:p>
@@ -2119,7 +2155,19 @@
         </w:numPr>
       </w:pPr>
       <w:r>
-        <w:t>Boodskap is verpligtend vir Navrae.</w:t>
+        <w:t>Die besoek</w:t>
+      </w:r>
+      <w:r>
+        <w:t xml:space="preserve"> </w:t>
+      </w:r>
+      <w:r>
+        <w:t>datum</w:t>
+      </w:r>
+      <w:r>
+        <w:t xml:space="preserve"> en </w:t>
+      </w:r>
+      <w:r>
+        <w:t>tyd groep word slegs gewys as “Plaas besoek” gekies word.</w:t>
       </w:r>
     </w:p>
     <w:p>
@@ -2131,7 +2179,7 @@
         </w:numPr>
       </w:pPr>
       <w:r>
-        <w:t>Terme-checkbox is verpligtend.</w:t>
+        <w:t>Boodskap is verpligtend vir Navrae.</w:t>
       </w:r>
     </w:p>
     <w:p>
@@ -2143,52 +2191,13 @@
         </w:numPr>
       </w:pPr>
       <w:r>
-        <w:t>Die vorm word met handleSubmit(event) gevalideer en wys ’n sukses-boodskap.</w:t>
-      </w:r>
-    </w:p>
-    <w:p>
-      <w:pPr>
-        <w:pStyle w:val="Heading2"/>
-      </w:pPr>
-      <w:bookmarkStart w:id="12" w:name="_Toc226380856"/>
-      <w:r>
-        <w:lastRenderedPageBreak/>
-        <w:t>Responsiewe CSS verduideliking</w:t>
-      </w:r>
-      <w:bookmarkEnd w:id="12"/>
-    </w:p>
-    <w:p>
-      <w:pPr>
-        <w:pStyle w:val="Heading3"/>
-      </w:pPr>
-      <w:bookmarkStart w:id="13" w:name="_Toc226380857"/>
-      <w:r>
-        <w:t>Mobiele skerm (480 tot 360)</w:t>
-      </w:r>
-      <w:bookmarkEnd w:id="13"/>
-    </w:p>
-    <w:p>
-      <w:pPr>
-        <w:pStyle w:val="Heading4"/>
-      </w:pPr>
-      <w:r>
-        <w:t>Kop en navigasie</w:t>
-      </w:r>
-    </w:p>
-    <w:p>
-      <w:pPr>
-        <w:spacing w:after="0"/>
-        <w:rPr>
-          <w:b/>
-          <w:bCs/>
-        </w:rPr>
-      </w:pPr>
-      <w:r>
-        <w:rPr>
-          <w:b/>
-          <w:bCs/>
-        </w:rPr>
-        <w:t>Navigasie</w:t>
+        <w:t>Terme</w:t>
+      </w:r>
+      <w:r>
+        <w:t xml:space="preserve"> </w:t>
+      </w:r>
+      <w:r>
+        <w:t>checkbox is verpligtend.</w:t>
       </w:r>
     </w:p>
     <w:p>
@@ -2200,27 +2209,67 @@
         </w:numPr>
       </w:pPr>
       <w:r>
-        <w:t xml:space="preserve">Die hamburger menu knoppie se font is kleienr gemaak </w:t>
-      </w:r>
-      <w:r>
-        <w:rPr>
-          <w:rStyle w:val="Heading5Char"/>
-        </w:rPr>
-        <w:t>(</w:t>
-      </w:r>
-      <w:r>
-        <w:rPr>
-          <w:rStyle w:val="Heading5Char"/>
+        <w:t xml:space="preserve">Die vorm word met </w:t>
+      </w:r>
+      <w:r>
+        <w:rPr>
+          <w:rStyle w:val="CSSKlasreelsChar"/>
+        </w:rPr>
+        <w:t>handleSubmit(event)</w:t>
+      </w:r>
+      <w:r>
+        <w:t xml:space="preserve"> gevalideer en wys ’n sukses</w:t>
+      </w:r>
+      <w:r>
+        <w:t xml:space="preserve"> </w:t>
+      </w:r>
+      <w:r>
+        <w:t>boodskap.</w:t>
+      </w:r>
+    </w:p>
+    <w:p>
+      <w:pPr>
+        <w:pStyle w:val="Heading2"/>
+      </w:pPr>
+      <w:bookmarkStart w:id="12" w:name="_Toc226380856"/>
+      <w:r>
+        <w:lastRenderedPageBreak/>
+        <w:t>Responsiewe CSS verduideliking</w:t>
+      </w:r>
+      <w:bookmarkEnd w:id="12"/>
+    </w:p>
+    <w:p>
+      <w:pPr>
+        <w:pStyle w:val="Heading3"/>
+      </w:pPr>
+      <w:bookmarkStart w:id="13" w:name="_Toc226380857"/>
+      <w:r>
+        <w:t>Mobiele skerm (480 tot 360)</w:t>
+      </w:r>
+      <w:bookmarkEnd w:id="13"/>
+    </w:p>
+    <w:p>
+      <w:pPr>
+        <w:pStyle w:val="Heading4"/>
+      </w:pPr>
+      <w:r>
+        <w:t>Kop en navigasie</w:t>
+      </w:r>
+    </w:p>
+    <w:p>
+      <w:pPr>
+        <w:spacing w:after="0"/>
+        <w:rPr>
           <w:b/>
           <w:bCs/>
         </w:rPr>
-        <w:t>.</w:t>
-      </w:r>
-      <w:r>
-        <w:rPr>
-          <w:rStyle w:val="Heading5Char"/>
-        </w:rPr>
-        <w:t>menu-toggle)</w:t>
+      </w:pPr>
+      <w:r>
+        <w:rPr>
+          <w:b/>
+          <w:bCs/>
+        </w:rPr>
+        <w:t>Navigasie</w:t>
       </w:r>
     </w:p>
     <w:p>
@@ -2232,7 +2281,7 @@
         </w:numPr>
       </w:pPr>
       <w:r>
-        <w:t>(.nav)</w:t>
+        <w:t>Die navigasie verander in ‘n hamburger menu vir makliker navigasie.</w:t>
       </w:r>
     </w:p>
     <w:p>
@@ -2244,10 +2293,62 @@
         </w:numPr>
       </w:pPr>
       <w:r>
+        <w:t>Die hamburger menu knoppie se font is kleie</w:t>
+      </w:r>
+      <w:r>
+        <w:t>ner</w:t>
+      </w:r>
+      <w:r>
+        <w:t xml:space="preserve"> gemaak </w:t>
+      </w:r>
+      <w:r>
+        <w:rPr>
+          <w:rStyle w:val="Heading5Char"/>
+        </w:rPr>
+        <w:t>(</w:t>
+      </w:r>
+      <w:r>
+        <w:rPr>
+          <w:rStyle w:val="Heading5Char"/>
+          <w:b/>
+          <w:bCs/>
+        </w:rPr>
+        <w:t>.</w:t>
+      </w:r>
+      <w:r>
+        <w:rPr>
+          <w:rStyle w:val="Heading5Char"/>
+        </w:rPr>
+        <w:t>menu-toggle)</w:t>
+      </w:r>
+    </w:p>
+    <w:p>
+      <w:pPr>
+        <w:pStyle w:val="ListParagraph"/>
+        <w:numPr>
+          <w:ilvl w:val="0"/>
+          <w:numId w:val="33"/>
+        </w:numPr>
+      </w:pPr>
+      <w:r>
         <w:t>Sweef effek op skakels is weggevat sodat skakels nie buit of oor die skermgrense gaan</w:t>
       </w:r>
       <w:r>
-        <w:t>(.nav a:hover</w:t>
+        <w:t>(</w:t>
+      </w:r>
+      <w:r>
+        <w:rPr>
+          <w:rStyle w:val="Heading5Char"/>
+          <w:b/>
+          <w:bCs/>
+        </w:rPr>
+        <w:t>.</w:t>
+      </w:r>
+      <w:r>
+        <w:rPr>
+          <w:rStyle w:val="Heading5Char"/>
+        </w:rPr>
+        <w:t>nav a:hover</w:t>
       </w:r>
       <w:r>
         <w:t>)</w:t>
@@ -2469,7 +2570,16 @@
         </w:numPr>
       </w:pPr>
       <w:r>
-        <w:t>Terug-na-bo knoppie (#topBtn) bly regs onder.</w:t>
+        <w:t>Terug-na-bo knoppie (</w:t>
+      </w:r>
+      <w:r>
+        <w:rPr>
+          <w:rStyle w:val="Heading5Char"/>
+        </w:rPr>
+        <w:t>#topBtn</w:t>
+      </w:r>
+      <w:r>
+        <w:t>) bly regs onder.</w:t>
       </w:r>
     </w:p>
     <w:p>

</xml_diff>